<commit_message>
Fix plantillas Word (ZIP con /); permitir devolver estados; notas del caso editables.
</commit_message>
<xml_diff>
--- a/apps/api/templates/informes/auditoria-consultorio.docx
+++ b/apps/api/templates/informes/auditoria-consultorio.docx
@@ -1,5 +1,5 @@
 
-<file path=word\document.xml><?xml version="1.0" encoding="utf-8"?>
+<file path=word/document.xml><?xml version="1.0" encoding="utf-8"?>
 <w:document xmlns:mc="http://schemas.openxmlformats.org/markup-compatibility/2006" xmlns:o="urn:schemas-microsoft-com:office:office" xmlns:r="http://schemas.openxmlformats.org/officeDocument/2006/relationships" xmlns:m="http://schemas.openxmlformats.org/officeDocument/2006/math" xmlns:v="urn:schemas-microsoft-com:vml" xmlns:wp="http://schemas.openxmlformats.org/drawingml/2006/wordprocessingDrawing" xmlns:w10="urn:schemas-microsoft-com:office:word" xmlns:w="http://schemas.openxmlformats.org/wordprocessingml/2006/main" xmlns:wne="http://schemas.microsoft.com/office/word/2006/wordml" xmlns:sl="http://schemas.openxmlformats.org/schemaLibrary/2006/main" xmlns:a="http://schemas.openxmlformats.org/drawingml/2006/main" xmlns:pic="http://schemas.openxmlformats.org/drawingml/2006/picture" xmlns:c="http://schemas.openxmlformats.org/drawingml/2006/chart" xmlns:lc="http://schemas.openxmlformats.org/drawingml/2006/lockedCanvas" xmlns:dgm="http://schemas.openxmlformats.org/drawingml/2006/diagram" xmlns:wps="http://schemas.microsoft.com/office/word/2010/wordprocessingShape" xmlns:wpg="http://schemas.microsoft.com/office/word/2010/wordprocessingGroup" xmlns:w14="http://schemas.microsoft.com/office/word/2010/wordml" xmlns:w15="http://schemas.microsoft.com/office/word/2012/wordml" xmlns:w16="http://schemas.microsoft.com/office/word/2018/wordml" xmlns:w16cex="http://schemas.microsoft.com/office/word/2018/wordml/cex" xmlns:w16cid="http://schemas.microsoft.com/office/word/2016/wordml/cid" xmlns="http://schemas.microsoft.com/office/tasks/2019/documenttasks" xmlns:cr="http://schemas.microsoft.com/office/comments/2020/reactions">
   <w:body>
     <w:p>
@@ -323,13 +323,7 @@
 </w:document>
 </file>
 
-<file path=word\fontTable.xml><?xml version="1.0" encoding="utf-8"?>
-<w:fonts xmlns:mc="http://schemas.openxmlformats.org/markup-compatibility/2006" xmlns:o="urn:schemas-microsoft-com:office:office" xmlns:r="http://schemas.openxmlformats.org/officeDocument/2006/relationships" xmlns:m="http://schemas.openxmlformats.org/officeDocument/2006/math" xmlns:v="urn:schemas-microsoft-com:vml" xmlns:wp="http://schemas.openxmlformats.org/drawingml/2006/wordprocessingDrawing" xmlns:w10="urn:schemas-microsoft-com:office:word" xmlns:w="http://schemas.openxmlformats.org/wordprocessingml/2006/main" xmlns:wne="http://schemas.microsoft.com/office/word/2006/wordml" xmlns:sl="http://schemas.openxmlformats.org/schemaLibrary/2006/main" xmlns:a="http://schemas.openxmlformats.org/drawingml/2006/main" xmlns:pic="http://schemas.openxmlformats.org/drawingml/2006/picture" xmlns:c="http://schemas.openxmlformats.org/drawingml/2006/chart" xmlns:lc="http://schemas.openxmlformats.org/drawingml/2006/lockedCanvas" xmlns:dgm="http://schemas.openxmlformats.org/drawingml/2006/diagram" xmlns:wps="http://schemas.microsoft.com/office/word/2010/wordprocessingShape" xmlns:wpg="http://schemas.microsoft.com/office/word/2010/wordprocessingGroup" xmlns:w14="http://schemas.microsoft.com/office/word/2010/wordml" xmlns:w15="http://schemas.microsoft.com/office/word/2012/wordml" xmlns:w16="http://schemas.microsoft.com/office/word/2018/wordml" xmlns:w16cex="http://schemas.microsoft.com/office/word/2018/wordml/cex" xmlns:w16cid="http://schemas.microsoft.com/office/word/2016/wordml/cid" xmlns="http://schemas.microsoft.com/office/tasks/2019/documenttasks" xmlns:cr="http://schemas.microsoft.com/office/comments/2020/reactions">
-  <w:font w:name="Arial"/>
-</w:fonts>
-</file>
-
-<file path=word\footer1.xml><?xml version="1.0" encoding="utf-8"?>
+<file path=word/footer1.xml><?xml version="1.0" encoding="utf-8"?>
 <w:ftr xmlns:mc="http://schemas.openxmlformats.org/markup-compatibility/2006" xmlns:o="urn:schemas-microsoft-com:office:office" xmlns:r="http://schemas.openxmlformats.org/officeDocument/2006/relationships" xmlns:m="http://schemas.openxmlformats.org/officeDocument/2006/math" xmlns:v="urn:schemas-microsoft-com:vml" xmlns:wp="http://schemas.openxmlformats.org/drawingml/2006/wordprocessingDrawing" xmlns:w10="urn:schemas-microsoft-com:office:word" xmlns:w="http://schemas.openxmlformats.org/wordprocessingml/2006/main" xmlns:wne="http://schemas.microsoft.com/office/word/2006/wordml" xmlns:sl="http://schemas.openxmlformats.org/schemaLibrary/2006/main" xmlns:a="http://schemas.openxmlformats.org/drawingml/2006/main" xmlns:pic="http://schemas.openxmlformats.org/drawingml/2006/picture" xmlns:c="http://schemas.openxmlformats.org/drawingml/2006/chart" xmlns:lc="http://schemas.openxmlformats.org/drawingml/2006/lockedCanvas" xmlns:dgm="http://schemas.openxmlformats.org/drawingml/2006/diagram" xmlns:wps="http://schemas.microsoft.com/office/word/2010/wordprocessingShape" xmlns:wpg="http://schemas.microsoft.com/office/word/2010/wordprocessingGroup" xmlns:w14="http://schemas.microsoft.com/office/word/2010/wordml" xmlns:w15="http://schemas.microsoft.com/office/word/2012/wordml" xmlns:w16="http://schemas.microsoft.com/office/word/2018/wordml" xmlns:w16cex="http://schemas.microsoft.com/office/word/2018/wordml/cex" xmlns:w16cid="http://schemas.microsoft.com/office/word/2016/wordml/cid" xmlns="http://schemas.microsoft.com/office/tasks/2019/documenttasks" xmlns:cr="http://schemas.microsoft.com/office/comments/2020/reactions">
   <w:p>
     <w:pPr>
@@ -346,7 +340,7 @@
 </w:ftr>
 </file>
 
-<file path=word\header1.xml><?xml version="1.0" encoding="utf-8"?>
+<file path=word/header1.xml><?xml version="1.0" encoding="utf-8"?>
 <w:hdr xmlns:mc="http://schemas.openxmlformats.org/markup-compatibility/2006" xmlns:o="urn:schemas-microsoft-com:office:office" xmlns:r="http://schemas.openxmlformats.org/officeDocument/2006/relationships" xmlns:m="http://schemas.openxmlformats.org/officeDocument/2006/math" xmlns:v="urn:schemas-microsoft-com:vml" xmlns:wp="http://schemas.openxmlformats.org/drawingml/2006/wordprocessingDrawing" xmlns:w10="urn:schemas-microsoft-com:office:word" xmlns:w="http://schemas.openxmlformats.org/wordprocessingml/2006/main" xmlns:wne="http://schemas.microsoft.com/office/word/2006/wordml" xmlns:sl="http://schemas.openxmlformats.org/schemaLibrary/2006/main" xmlns:a="http://schemas.openxmlformats.org/drawingml/2006/main" xmlns:pic="http://schemas.openxmlformats.org/drawingml/2006/picture" xmlns:c="http://schemas.openxmlformats.org/drawingml/2006/chart" xmlns:lc="http://schemas.openxmlformats.org/drawingml/2006/lockedCanvas" xmlns:dgm="http://schemas.openxmlformats.org/drawingml/2006/diagram" xmlns:wps="http://schemas.microsoft.com/office/word/2010/wordprocessingShape" xmlns:wpg="http://schemas.microsoft.com/office/word/2010/wordprocessingGroup" xmlns:w14="http://schemas.microsoft.com/office/word/2010/wordml" xmlns:w15="http://schemas.microsoft.com/office/word/2012/wordml" xmlns:w16="http://schemas.microsoft.com/office/word/2018/wordml" xmlns:w16cex="http://schemas.microsoft.com/office/word/2018/wordml/cex" xmlns:w16cid="http://schemas.microsoft.com/office/word/2016/wordml/cid" xmlns="http://schemas.microsoft.com/office/tasks/2019/documenttasks" xmlns:cr="http://schemas.microsoft.com/office/comments/2020/reactions">
   <w:p>
     <w:pPr>
@@ -428,22 +422,11 @@
 </w:hdr>
 </file>
 
-<file path=word\numbering.xml><?xml version="1.0" encoding="utf-8"?>
+<file path=word/numbering.xml><?xml version="1.0" encoding="utf-8"?>
 <w:numbering xmlns:mc="http://schemas.openxmlformats.org/markup-compatibility/2006" xmlns:o="urn:schemas-microsoft-com:office:office" xmlns:r="http://schemas.openxmlformats.org/officeDocument/2006/relationships" xmlns:m="http://schemas.openxmlformats.org/officeDocument/2006/math" xmlns:v="urn:schemas-microsoft-com:vml" xmlns:wp="http://schemas.openxmlformats.org/drawingml/2006/wordprocessingDrawing" xmlns:w10="urn:schemas-microsoft-com:office:word" xmlns:w="http://schemas.openxmlformats.org/wordprocessingml/2006/main" xmlns:wne="http://schemas.microsoft.com/office/word/2006/wordml" xmlns:sl="http://schemas.openxmlformats.org/schemaLibrary/2006/main" xmlns:a="http://schemas.openxmlformats.org/drawingml/2006/main" xmlns:pic="http://schemas.openxmlformats.org/drawingml/2006/picture" xmlns:c="http://schemas.openxmlformats.org/drawingml/2006/chart" xmlns:lc="http://schemas.openxmlformats.org/drawingml/2006/lockedCanvas" xmlns:dgm="http://schemas.openxmlformats.org/drawingml/2006/diagram" xmlns:wps="http://schemas.microsoft.com/office/word/2010/wordprocessingShape" xmlns:wpg="http://schemas.microsoft.com/office/word/2010/wordprocessingGroup" xmlns:w14="http://schemas.microsoft.com/office/word/2010/wordml" xmlns:w15="http://schemas.microsoft.com/office/word/2012/wordml" xmlns:w16="http://schemas.microsoft.com/office/word/2018/wordml" xmlns:w16cex="http://schemas.microsoft.com/office/word/2018/wordml/cex" xmlns:w16cid="http://schemas.microsoft.com/office/word/2016/wordml/cid" xmlns="http://schemas.microsoft.com/office/tasks/2019/documenttasks" xmlns:cr="http://schemas.microsoft.com/office/comments/2020/reactions"/>
 </file>
 
-<file path=word\settings.xml><?xml version="1.0" encoding="utf-8"?>
-<w:settings xmlns:mc="http://schemas.openxmlformats.org/markup-compatibility/2006" xmlns:o="urn:schemas-microsoft-com:office:office" xmlns:r="http://schemas.openxmlformats.org/officeDocument/2006/relationships" xmlns:m="http://schemas.openxmlformats.org/officeDocument/2006/math" xmlns:v="urn:schemas-microsoft-com:vml" xmlns:wp="http://schemas.openxmlformats.org/drawingml/2006/wordprocessingDrawing" xmlns:w10="urn:schemas-microsoft-com:office:word" xmlns:w="http://schemas.openxmlformats.org/wordprocessingml/2006/main" xmlns:wne="http://schemas.microsoft.com/office/word/2006/wordml" xmlns:sl="http://schemas.openxmlformats.org/schemaLibrary/2006/main" xmlns:a="http://schemas.openxmlformats.org/drawingml/2006/main" xmlns:pic="http://schemas.openxmlformats.org/drawingml/2006/picture" xmlns:c="http://schemas.openxmlformats.org/drawingml/2006/chart" xmlns:lc="http://schemas.openxmlformats.org/drawingml/2006/lockedCanvas" xmlns:dgm="http://schemas.openxmlformats.org/drawingml/2006/diagram" xmlns:wps="http://schemas.microsoft.com/office/word/2010/wordprocessingShape" xmlns:wpg="http://schemas.microsoft.com/office/word/2010/wordprocessingGroup" xmlns:w14="http://schemas.microsoft.com/office/word/2010/wordml" xmlns:w15="http://schemas.microsoft.com/office/word/2012/wordml" xmlns:w16="http://schemas.microsoft.com/office/word/2018/wordml" xmlns:w16cex="http://schemas.microsoft.com/office/word/2018/wordml/cex" xmlns:w16cid="http://schemas.microsoft.com/office/word/2016/wordml/cid" xmlns="http://schemas.microsoft.com/office/tasks/2019/documenttasks" xmlns:cr="http://schemas.microsoft.com/office/comments/2020/reactions">
-  <w:embedTrueTypeFonts w:val="1"/>
-  <w:defaultTabStop w:val="720"/>
-  <w:compat>
-    <w:compatSetting w:val="15" w:name="compatibilityMode" w:uri="http://schemas.microsoft.com/office/word"/>
-  </w:compat>
-  <w:clrSchemeMapping w:bg1="light1" w:t1="dark1" w:bg2="light2" w:t2="dark2" w:accent1="accent1" w:accent2="accent2" w:accent3="accent3" w:accent4="accent4" w:accent5="accent5" w:accent6="accent6" w:hyperlink="hyperlink" w:followedHyperlink="followedHyperlink"/>
-</w:settings>
-</file>
-
-<file path=word\styles.xml><?xml version="1.0" encoding="utf-8"?>
+<file path=word/styles.xml><?xml version="1.0" encoding="utf-8"?>
 <w:styles xmlns:mc="http://schemas.openxmlformats.org/markup-compatibility/2006" xmlns:o="urn:schemas-microsoft-com:office:office" xmlns:r="http://schemas.openxmlformats.org/officeDocument/2006/relationships" xmlns:m="http://schemas.openxmlformats.org/officeDocument/2006/math" xmlns:v="urn:schemas-microsoft-com:vml" xmlns:wp="http://schemas.openxmlformats.org/drawingml/2006/wordprocessingDrawing" xmlns:w10="urn:schemas-microsoft-com:office:word" xmlns:w="http://schemas.openxmlformats.org/wordprocessingml/2006/main" xmlns:wne="http://schemas.microsoft.com/office/word/2006/wordml" xmlns:sl="http://schemas.openxmlformats.org/schemaLibrary/2006/main" xmlns:a="http://schemas.openxmlformats.org/drawingml/2006/main" xmlns:pic="http://schemas.openxmlformats.org/drawingml/2006/picture" xmlns:c="http://schemas.openxmlformats.org/drawingml/2006/chart" xmlns:lc="http://schemas.openxmlformats.org/drawingml/2006/lockedCanvas" xmlns:dgm="http://schemas.openxmlformats.org/drawingml/2006/diagram" xmlns:wps="http://schemas.microsoft.com/office/word/2010/wordprocessingShape" xmlns:wpg="http://schemas.microsoft.com/office/word/2010/wordprocessingGroup" xmlns:w14="http://schemas.microsoft.com/office/word/2010/wordml" xmlns:w15="http://schemas.microsoft.com/office/word/2012/wordml" xmlns:w16="http://schemas.microsoft.com/office/word/2018/wordml" xmlns:w16cex="http://schemas.microsoft.com/office/word/2018/wordml/cex" xmlns:w16cid="http://schemas.microsoft.com/office/word/2016/wordml/cid" xmlns="http://schemas.microsoft.com/office/tasks/2019/documenttasks" xmlns:cr="http://schemas.microsoft.com/office/comments/2020/reactions">
   <w:docDefaults>
     <w:rPrDefault>
@@ -611,7 +594,7 @@
 </w:styles>
 </file>
 
-<file path=word\theme\theme1.xml><?xml version="1.0" encoding="utf-8"?>
+<file path=word/theme/theme1.xml><?xml version="1.0" encoding="utf-8"?>
 <a:theme xmlns:a="http://schemas.openxmlformats.org/drawingml/2006/main" name="Office Theme">
   <a:themeElements>
     <a:clrScheme name="Office">

</xml_diff>